<commit_message>
Add commit hash to report
</commit_message>
<xml_diff>
--- a/Звіт.docx
+++ b/Звіт.docx
@@ -15169,7 +15169,7 @@
         <w:t xml:space="preserve">коміт </w:t>
       </w:r>
       <w:r>
-        <w:t>4395b9e3e4ee82f6bfd07c629de3cb8345546c36</w:t>
+        <w:t>4bd7ee993062223cade5e5371f06f6f04ef228ac</w:t>
       </w:r>
       <w:r>
         <w:t>.</w:t>
@@ -16242,6 +16242,18 @@
       <w:shd w:val="clear" w:color="auto" w:fill="E1DFDD"/>
     </w:rPr>
   </w:style>
+  <w:style w:type="character" w:styleId="FollowedHyperlink">
+    <w:name w:val="FollowedHyperlink"/>
+    <w:basedOn w:val="DefaultParagraphFont"/>
+    <w:uiPriority w:val="99"/>
+    <w:semiHidden/>
+    <w:unhideWhenUsed/>
+    <w:rsid w:val="00802C2B"/>
+    <w:rPr>
+      <w:color w:val="96607D" w:themeColor="followedHyperlink"/>
+      <w:u w:val="single"/>
+    </w:rPr>
+  </w:style>
 </w:styles>
 </file>
 

</xml_diff>